<commit_message>
Expand auto-label handoff usage and performance guide
</commit_message>
<xml_diff>
--- a/reports/project_stage_report_feature-aotu-label.docx
+++ b/reports/project_stage_report_feature-aotu-label.docx
@@ -39,10 +39,7 @@
         <w:jc w:val="center"/>
       </w:pPr>
       <w:r>
-        <w:t>生成日期：2026-07-06</w:t>
-      </w:r>
-      <w:r>
-        <w:br/>
+        <w:t>生成日期：2026-07-29</w:t>
       </w:r>
     </w:p>
     <w:p>
@@ -76,6 +73,7 @@
     <w:p>
       <w:pPr>
         <w:pStyle w:val="1"/>
+        <w:keepNext/>
         <w:rPr>
           <w:lang w:eastAsia="zh-CN"/>
         </w:rPr>
@@ -140,15 +138,13 @@
         <w:pStyle w:val="a0"/>
       </w:pPr>
       <w:r>
-        <w:rPr>
-          <w:sz w:val="21"/>
-        </w:rPr>
-        <w:t>代码来源：当前 Git 分支 feature/aotu-label，远端分支为 chzhou007/feature/aotu-label。</w:t>
+        <w:t>代码来源：GitHub 仓库 chzhou007/auto-label-project，当前交付内容已进入 main。</w:t>
       </w:r>
     </w:p>
     <w:p>
       <w:pPr>
         <w:pStyle w:val="1"/>
+        <w:keepNext/>
       </w:pPr>
       <w:r>
         <w:rPr>
@@ -823,6 +819,7 @@
     <w:p>
       <w:pPr>
         <w:pStyle w:val="1"/>
+        <w:keepNext/>
       </w:pPr>
       <w:r>
         <w:rPr>
@@ -1347,6 +1344,7 @@
     <w:p>
       <w:pPr>
         <w:pStyle w:val="1"/>
+        <w:keepNext/>
       </w:pPr>
       <w:r>
         <w:rPr>
@@ -1794,6 +1792,7 @@
     <w:p>
       <w:pPr>
         <w:pStyle w:val="1"/>
+        <w:keepNext/>
       </w:pPr>
       <w:r>
         <w:rPr>
@@ -1861,6 +1860,7 @@
     <w:p>
       <w:pPr>
         <w:pStyle w:val="1"/>
+        <w:keepNext/>
       </w:pPr>
       <w:r>
         <w:rPr>
@@ -2128,7 +2128,7 @@
               <w:rPr>
                 <w:sz w:val="19"/>
               </w:rPr>
-              <w:t>https://github.com/chzhou007/auto-label-project/tree/feature/aotu-label</w:t>
+              <w:t>https://github.com/chzhou007/auto-label-project/tree/main</w:t>
             </w:r>
           </w:p>
         </w:tc>
@@ -2138,17 +2138,2063 @@
     <w:p>
       <w:pPr>
         <w:pStyle w:val="1"/>
+        <w:keepNext/>
+        <w:keepLines w:val="0"/>
+      </w:pPr>
+      <w:r>
+        <w:t>7. 使用方法、性能对齐与当前性能</w:t>
+      </w:r>
+    </w:p>
+    <w:p>
+      <w:pPr>
+        <w:keepLines w:val="0"/>
+      </w:pPr>
+      <w:r>
+        <w:t>本章面向接手人员，说明三类 benchmark 脚本如何串联使用、正式性能对齐时必须固定哪些条件，以及当前结果能够支持到什么结论。当前交付定位仍是高精度自动预标注与人工复核辅助，不应把少量样本结果直接解释为生产级无人值守性能。</w:t>
+      </w:r>
+    </w:p>
+    <w:p>
+      <w:pPr>
+        <w:pStyle w:val="21"/>
+        <w:keepNext/>
+        <w:keepLines w:val="0"/>
+      </w:pPr>
+      <w:r>
+        <w:t>7.1 快速上手</w:t>
+      </w:r>
+    </w:p>
+    <w:tbl>
+      <w:tblPr>
+        <w:tblStyle w:val="aff1"/>
+        <w:tblW w:type="auto" w:w="0"/>
+        <w:tblLayout w:type="fixed"/>
+        <w:tblLook w:firstColumn="1" w:firstRow="1" w:lastColumn="0" w:lastRow="0" w:noHBand="0" w:noVBand="1" w:val="04A0"/>
+      </w:tblPr>
+      <w:tblGrid>
+        <w:gridCol w:w="2484"/>
+        <w:gridCol w:w="2484"/>
+        <w:gridCol w:w="2484"/>
+        <w:gridCol w:w="2484"/>
+      </w:tblGrid>
+      <w:tr>
+        <w:trPr>
+          <w:tblHeader w:val="true"/>
+        </w:trPr>
+        <w:tc>
+          <w:tcPr>
+            <w:tcW w:type="dxa" w:w="551"/>
+            <w:vAlign w:val="center"/>
+            <w:tcMar>
+              <w:top w:w="90" w:type="dxa"/>
+              <w:start w:w="110" w:type="dxa"/>
+              <w:bottom w:w="90" w:type="dxa"/>
+              <w:end w:w="110" w:type="dxa"/>
+            </w:tcMar>
+            <w:shd w:fill="D9EAF7"/>
+          </w:tcPr>
+          <w:p>
+            <w:pPr>
+              <w:spacing w:before="0" w:after="0" w:line="252" w:lineRule="auto"/>
+            </w:pPr>
+            <w:r>
+              <w:rPr>
+                <w:b/>
+                <w:sz w:val="17"/>
+              </w:rPr>
+              <w:t>步骤</w:t>
+            </w:r>
+          </w:p>
+        </w:tc>
+        <w:tc>
+          <w:tcPr>
+            <w:tcW w:type="dxa" w:w="1417"/>
+            <w:vAlign w:val="center"/>
+            <w:tcMar>
+              <w:top w:w="90" w:type="dxa"/>
+              <w:start w:w="110" w:type="dxa"/>
+              <w:bottom w:w="90" w:type="dxa"/>
+              <w:end w:w="110" w:type="dxa"/>
+            </w:tcMar>
+            <w:shd w:fill="D9EAF7"/>
+          </w:tcPr>
+          <w:p>
+            <w:pPr>
+              <w:spacing w:before="0" w:after="0" w:line="252" w:lineRule="auto"/>
+            </w:pPr>
+            <w:r>
+              <w:rPr>
+                <w:b/>
+                <w:sz w:val="17"/>
+              </w:rPr>
+              <w:t>动作</w:t>
+            </w:r>
+          </w:p>
+        </w:tc>
+        <w:tc>
+          <w:tcPr>
+            <w:tcW w:type="dxa" w:w="5039"/>
+            <w:vAlign w:val="center"/>
+            <w:tcMar>
+              <w:top w:w="90" w:type="dxa"/>
+              <w:start w:w="110" w:type="dxa"/>
+              <w:bottom w:w="90" w:type="dxa"/>
+              <w:end w:w="110" w:type="dxa"/>
+            </w:tcMar>
+            <w:shd w:fill="D9EAF7"/>
+          </w:tcPr>
+          <w:p>
+            <w:pPr>
+              <w:spacing w:before="0" w:after="0" w:line="252" w:lineRule="auto"/>
+            </w:pPr>
+            <w:r>
+              <w:rPr>
+                <w:b/>
+                <w:sz w:val="17"/>
+              </w:rPr>
+              <w:t>关键说明</w:t>
+            </w:r>
+          </w:p>
+        </w:tc>
+        <w:tc>
+          <w:tcPr>
+            <w:tcW w:type="dxa" w:w="2205"/>
+            <w:vAlign w:val="center"/>
+            <w:tcMar>
+              <w:top w:w="90" w:type="dxa"/>
+              <w:start w:w="110" w:type="dxa"/>
+              <w:bottom w:w="90" w:type="dxa"/>
+              <w:end w:w="110" w:type="dxa"/>
+            </w:tcMar>
+            <w:shd w:fill="D9EAF7"/>
+          </w:tcPr>
+          <w:p>
+            <w:pPr>
+              <w:spacing w:before="0" w:after="0" w:line="252" w:lineRule="auto"/>
+            </w:pPr>
+            <w:r>
+              <w:rPr>
+                <w:b/>
+                <w:sz w:val="17"/>
+              </w:rPr>
+              <w:t>主要输出</w:t>
+            </w:r>
+          </w:p>
+        </w:tc>
+      </w:tr>
+      <w:tr>
+        <w:tc>
+          <w:tcPr>
+            <w:tcW w:type="dxa" w:w="551"/>
+            <w:vAlign w:val="center"/>
+            <w:tcMar>
+              <w:top w:w="90" w:type="dxa"/>
+              <w:start w:w="110" w:type="dxa"/>
+              <w:bottom w:w="90" w:type="dxa"/>
+              <w:end w:w="110" w:type="dxa"/>
+            </w:tcMar>
+          </w:tcPr>
+          <w:p>
+            <w:pPr>
+              <w:spacing w:before="0" w:after="0" w:line="252" w:lineRule="auto"/>
+              <w:jc w:val="center"/>
+            </w:pPr>
+            <w:r>
+              <w:rPr>
+                <w:sz w:val="17"/>
+              </w:rPr>
+              <w:t>1</w:t>
+            </w:r>
+          </w:p>
+        </w:tc>
+        <w:tc>
+          <w:tcPr>
+            <w:tcW w:type="dxa" w:w="1417"/>
+            <w:vAlign w:val="center"/>
+            <w:tcMar>
+              <w:top w:w="90" w:type="dxa"/>
+              <w:start w:w="110" w:type="dxa"/>
+              <w:bottom w:w="90" w:type="dxa"/>
+              <w:end w:w="110" w:type="dxa"/>
+            </w:tcMar>
+          </w:tcPr>
+          <w:p>
+            <w:pPr>
+              <w:spacing w:before="0" w:after="0" w:line="252" w:lineRule="auto"/>
+            </w:pPr>
+            <w:r>
+              <w:rPr>
+                <w:sz w:val="17"/>
+              </w:rPr>
+              <w:t>准备环境</w:t>
+            </w:r>
+          </w:p>
+        </w:tc>
+        <w:tc>
+          <w:tcPr>
+            <w:tcW w:type="dxa" w:w="5039"/>
+            <w:vAlign w:val="center"/>
+            <w:tcMar>
+              <w:top w:w="90" w:type="dxa"/>
+              <w:start w:w="110" w:type="dxa"/>
+              <w:bottom w:w="90" w:type="dxa"/>
+              <w:end w:w="110" w:type="dxa"/>
+            </w:tcMar>
+          </w:tcPr>
+          <w:p>
+            <w:pPr>
+              <w:spacing w:before="0" w:after="0" w:line="252" w:lineRule="auto"/>
+            </w:pPr>
+            <w:r>
+              <w:rPr>
+                <w:sz w:val="17"/>
+              </w:rPr>
+              <w:t>安装 requirements.txt；启动本地 Ollama；准备 Label Studio 导出或服务账号。</w:t>
+            </w:r>
+          </w:p>
+        </w:tc>
+        <w:tc>
+          <w:tcPr>
+            <w:tcW w:type="dxa" w:w="2205"/>
+            <w:vAlign w:val="center"/>
+            <w:tcMar>
+              <w:top w:w="90" w:type="dxa"/>
+              <w:start w:w="110" w:type="dxa"/>
+              <w:bottom w:w="90" w:type="dxa"/>
+              <w:end w:w="110" w:type="dxa"/>
+            </w:tcMar>
+          </w:tcPr>
+          <w:p>
+            <w:pPr>
+              <w:spacing w:before="0" w:after="0" w:line="252" w:lineRule="auto"/>
+            </w:pPr>
+            <w:r>
+              <w:rPr>
+                <w:sz w:val="17"/>
+              </w:rPr>
+              <w:t>Python 环境、模型服务可用</w:t>
+            </w:r>
+          </w:p>
+        </w:tc>
+      </w:tr>
+      <w:tr>
+        <w:tc>
+          <w:tcPr>
+            <w:tcW w:type="dxa" w:w="551"/>
+            <w:vAlign w:val="center"/>
+            <w:tcMar>
+              <w:top w:w="90" w:type="dxa"/>
+              <w:start w:w="110" w:type="dxa"/>
+              <w:bottom w:w="90" w:type="dxa"/>
+              <w:end w:w="110" w:type="dxa"/>
+            </w:tcMar>
+          </w:tcPr>
+          <w:p>
+            <w:pPr>
+              <w:spacing w:before="0" w:after="0" w:line="252" w:lineRule="auto"/>
+              <w:jc w:val="center"/>
+            </w:pPr>
+            <w:r>
+              <w:rPr>
+                <w:sz w:val="17"/>
+              </w:rPr>
+              <w:t>2</w:t>
+            </w:r>
+          </w:p>
+        </w:tc>
+        <w:tc>
+          <w:tcPr>
+            <w:tcW w:type="dxa" w:w="1417"/>
+            <w:vAlign w:val="center"/>
+            <w:tcMar>
+              <w:top w:w="90" w:type="dxa"/>
+              <w:start w:w="110" w:type="dxa"/>
+              <w:bottom w:w="90" w:type="dxa"/>
+              <w:end w:w="110" w:type="dxa"/>
+            </w:tcMar>
+          </w:tcPr>
+          <w:p>
+            <w:pPr>
+              <w:spacing w:before="0" w:after="0" w:line="252" w:lineRule="auto"/>
+            </w:pPr>
+            <w:r>
+              <w:rPr>
+                <w:sz w:val="17"/>
+              </w:rPr>
+              <w:t>构建评测集</w:t>
+            </w:r>
+          </w:p>
+        </w:tc>
+        <w:tc>
+          <w:tcPr>
+            <w:tcW w:type="dxa" w:w="5039"/>
+            <w:vAlign w:val="center"/>
+            <w:tcMar>
+              <w:top w:w="90" w:type="dxa"/>
+              <w:start w:w="110" w:type="dxa"/>
+              <w:bottom w:w="90" w:type="dxa"/>
+              <w:end w:w="110" w:type="dxa"/>
+            </w:tcMar>
+          </w:tcPr>
+          <w:p>
+            <w:pPr>
+              <w:spacing w:before="0" w:after="0" w:line="252" w:lineRule="auto"/>
+            </w:pPr>
+            <w:r>
+              <w:rPr>
+                <w:sz w:val="17"/>
+              </w:rPr>
+              <w:t>运行 build_person_detection_benchmark.py，将人工 annotation 与 prediction/pseudo-GT 分开。</w:t>
+            </w:r>
+          </w:p>
+        </w:tc>
+        <w:tc>
+          <w:tcPr>
+            <w:tcW w:type="dxa" w:w="2205"/>
+            <w:vAlign w:val="center"/>
+            <w:tcMar>
+              <w:top w:w="90" w:type="dxa"/>
+              <w:start w:w="110" w:type="dxa"/>
+              <w:bottom w:w="90" w:type="dxa"/>
+              <w:end w:w="110" w:type="dxa"/>
+            </w:tcMar>
+          </w:tcPr>
+          <w:p>
+            <w:pPr>
+              <w:spacing w:before="0" w:after="0" w:line="252" w:lineRule="auto"/>
+            </w:pPr>
+            <w:r>
+              <w:rPr>
+                <w:sz w:val="17"/>
+              </w:rPr>
+              <w:t>benchmark JSON、CSV、summary</w:t>
+            </w:r>
+          </w:p>
+        </w:tc>
+      </w:tr>
+      <w:tr>
+        <w:tc>
+          <w:tcPr>
+            <w:tcW w:type="dxa" w:w="551"/>
+            <w:vAlign w:val="center"/>
+            <w:tcMar>
+              <w:top w:w="90" w:type="dxa"/>
+              <w:start w:w="110" w:type="dxa"/>
+              <w:bottom w:w="90" w:type="dxa"/>
+              <w:end w:w="110" w:type="dxa"/>
+            </w:tcMar>
+          </w:tcPr>
+          <w:p>
+            <w:pPr>
+              <w:spacing w:before="0" w:after="0" w:line="252" w:lineRule="auto"/>
+              <w:jc w:val="center"/>
+            </w:pPr>
+            <w:r>
+              <w:rPr>
+                <w:sz w:val="17"/>
+              </w:rPr>
+              <w:t>3</w:t>
+            </w:r>
+          </w:p>
+        </w:tc>
+        <w:tc>
+          <w:tcPr>
+            <w:tcW w:type="dxa" w:w="1417"/>
+            <w:vAlign w:val="center"/>
+            <w:tcMar>
+              <w:top w:w="90" w:type="dxa"/>
+              <w:start w:w="110" w:type="dxa"/>
+              <w:bottom w:w="90" w:type="dxa"/>
+              <w:end w:w="110" w:type="dxa"/>
+            </w:tcMar>
+          </w:tcPr>
+          <w:p>
+            <w:pPr>
+              <w:spacing w:before="0" w:after="0" w:line="252" w:lineRule="auto"/>
+            </w:pPr>
+            <w:r>
+              <w:rPr>
+                <w:sz w:val="17"/>
+              </w:rPr>
+              <w:t>建立基线</w:t>
+            </w:r>
+          </w:p>
+        </w:tc>
+        <w:tc>
+          <w:tcPr>
+            <w:tcW w:type="dxa" w:w="5039"/>
+            <w:vAlign w:val="center"/>
+            <w:tcMar>
+              <w:top w:w="90" w:type="dxa"/>
+              <w:start w:w="110" w:type="dxa"/>
+              <w:bottom w:w="90" w:type="dxa"/>
+              <w:end w:w="110" w:type="dxa"/>
+            </w:tcMar>
+          </w:tcPr>
+          <w:p>
+            <w:pPr>
+              <w:spacing w:before="0" w:after="0" w:line="252" w:lineRule="auto"/>
+            </w:pPr>
+            <w:r>
+              <w:rPr>
+                <w:sz w:val="17"/>
+              </w:rPr>
+              <w:t>运行 evaluate_person_detection_benchmark.py，计算已有 prediction 相对人工 annotation 的检测指标。</w:t>
+            </w:r>
+          </w:p>
+        </w:tc>
+        <w:tc>
+          <w:tcPr>
+            <w:tcW w:type="dxa" w:w="2205"/>
+            <w:vAlign w:val="center"/>
+            <w:tcMar>
+              <w:top w:w="90" w:type="dxa"/>
+              <w:start w:w="110" w:type="dxa"/>
+              <w:bottom w:w="90" w:type="dxa"/>
+              <w:end w:w="110" w:type="dxa"/>
+            </w:tcMar>
+          </w:tcPr>
+          <w:p>
+            <w:pPr>
+              <w:spacing w:before="0" w:after="0" w:line="252" w:lineRule="auto"/>
+            </w:pPr>
+            <w:r>
+              <w:rPr>
+                <w:sz w:val="17"/>
+              </w:rPr>
+              <w:t>evaluation JSON</w:t>
+            </w:r>
+          </w:p>
+        </w:tc>
+      </w:tr>
+      <w:tr>
+        <w:tc>
+          <w:tcPr>
+            <w:tcW w:type="dxa" w:w="551"/>
+            <w:vAlign w:val="center"/>
+            <w:tcMar>
+              <w:top w:w="90" w:type="dxa"/>
+              <w:start w:w="110" w:type="dxa"/>
+              <w:bottom w:w="90" w:type="dxa"/>
+              <w:end w:w="110" w:type="dxa"/>
+            </w:tcMar>
+          </w:tcPr>
+          <w:p>
+            <w:pPr>
+              <w:spacing w:before="0" w:after="0" w:line="252" w:lineRule="auto"/>
+              <w:jc w:val="center"/>
+            </w:pPr>
+            <w:r>
+              <w:rPr>
+                <w:sz w:val="17"/>
+              </w:rPr>
+              <w:t>4</w:t>
+            </w:r>
+          </w:p>
+        </w:tc>
+        <w:tc>
+          <w:tcPr>
+            <w:tcW w:type="dxa" w:w="1417"/>
+            <w:vAlign w:val="center"/>
+            <w:tcMar>
+              <w:top w:w="90" w:type="dxa"/>
+              <w:start w:w="110" w:type="dxa"/>
+              <w:bottom w:w="90" w:type="dxa"/>
+              <w:end w:w="110" w:type="dxa"/>
+            </w:tcMar>
+          </w:tcPr>
+          <w:p>
+            <w:pPr>
+              <w:spacing w:before="0" w:after="0" w:line="252" w:lineRule="auto"/>
+            </w:pPr>
+            <w:r>
+              <w:rPr>
+                <w:sz w:val="17"/>
+              </w:rPr>
+              <w:t>运行新模型</w:t>
+            </w:r>
+          </w:p>
+        </w:tc>
+        <w:tc>
+          <w:tcPr>
+            <w:tcW w:type="dxa" w:w="5039"/>
+            <w:vAlign w:val="center"/>
+            <w:tcMar>
+              <w:top w:w="90" w:type="dxa"/>
+              <w:start w:w="110" w:type="dxa"/>
+              <w:bottom w:w="90" w:type="dxa"/>
+              <w:end w:w="110" w:type="dxa"/>
+            </w:tcMar>
+          </w:tcPr>
+          <w:p>
+            <w:pPr>
+              <w:spacing w:before="0" w:after="0" w:line="252" w:lineRule="auto"/>
+            </w:pPr>
+            <w:r>
+              <w:rPr>
+                <w:sz w:val="17"/>
+              </w:rPr>
+              <w:t>运行 run_ollama_person_benchmark.py；先用 20 张无 tile 冒烟，再扩大样本或开启 tile。</w:t>
+            </w:r>
+          </w:p>
+        </w:tc>
+        <w:tc>
+          <w:tcPr>
+            <w:tcW w:type="dxa" w:w="2205"/>
+            <w:vAlign w:val="center"/>
+            <w:tcMar>
+              <w:top w:w="90" w:type="dxa"/>
+              <w:start w:w="110" w:type="dxa"/>
+              <w:bottom w:w="90" w:type="dxa"/>
+              <w:end w:w="110" w:type="dxa"/>
+            </w:tcMar>
+          </w:tcPr>
+          <w:p>
+            <w:pPr>
+              <w:spacing w:before="0" w:after="0" w:line="252" w:lineRule="auto"/>
+            </w:pPr>
+            <w:r>
+              <w:rPr>
+                <w:sz w:val="17"/>
+              </w:rPr>
+              <w:t>预测、原始响应、运行摘要</w:t>
+            </w:r>
+          </w:p>
+        </w:tc>
+      </w:tr>
+      <w:tr>
+        <w:tc>
+          <w:tcPr>
+            <w:tcW w:type="dxa" w:w="551"/>
+            <w:vAlign w:val="center"/>
+            <w:tcMar>
+              <w:top w:w="90" w:type="dxa"/>
+              <w:start w:w="110" w:type="dxa"/>
+              <w:bottom w:w="90" w:type="dxa"/>
+              <w:end w:w="110" w:type="dxa"/>
+            </w:tcMar>
+          </w:tcPr>
+          <w:p>
+            <w:pPr>
+              <w:spacing w:before="0" w:after="0" w:line="252" w:lineRule="auto"/>
+              <w:jc w:val="center"/>
+            </w:pPr>
+            <w:r>
+              <w:rPr>
+                <w:sz w:val="17"/>
+              </w:rPr>
+              <w:t>5</w:t>
+            </w:r>
+          </w:p>
+        </w:tc>
+        <w:tc>
+          <w:tcPr>
+            <w:tcW w:type="dxa" w:w="1417"/>
+            <w:vAlign w:val="center"/>
+            <w:tcMar>
+              <w:top w:w="90" w:type="dxa"/>
+              <w:start w:w="110" w:type="dxa"/>
+              <w:bottom w:w="90" w:type="dxa"/>
+              <w:end w:w="110" w:type="dxa"/>
+            </w:tcMar>
+          </w:tcPr>
+          <w:p>
+            <w:pPr>
+              <w:spacing w:before="0" w:after="0" w:line="252" w:lineRule="auto"/>
+            </w:pPr>
+            <w:r>
+              <w:rPr>
+                <w:sz w:val="17"/>
+              </w:rPr>
+              <w:t>复核结论</w:t>
+            </w:r>
+          </w:p>
+        </w:tc>
+        <w:tc>
+          <w:tcPr>
+            <w:tcW w:type="dxa" w:w="5039"/>
+            <w:vAlign w:val="center"/>
+            <w:tcMar>
+              <w:top w:w="90" w:type="dxa"/>
+              <w:start w:w="110" w:type="dxa"/>
+              <w:bottom w:w="90" w:type="dxa"/>
+              <w:end w:w="110" w:type="dxa"/>
+            </w:tcMar>
+          </w:tcPr>
+          <w:p>
+            <w:pPr>
+              <w:spacing w:before="0" w:after="0" w:line="252" w:lineRule="auto"/>
+            </w:pPr>
+            <w:r>
+              <w:rPr>
+                <w:sz w:val="17"/>
+              </w:rPr>
+              <w:t>检查失败数、样本构成、IoU 0.50/0.75 指标及漏检图，确认结果可比后再汇报。</w:t>
+            </w:r>
+          </w:p>
+        </w:tc>
+        <w:tc>
+          <w:tcPr>
+            <w:tcW w:type="dxa" w:w="2205"/>
+            <w:vAlign w:val="center"/>
+            <w:tcMar>
+              <w:top w:w="90" w:type="dxa"/>
+              <w:start w:w="110" w:type="dxa"/>
+              <w:bottom w:w="90" w:type="dxa"/>
+              <w:end w:w="110" w:type="dxa"/>
+            </w:tcMar>
+          </w:tcPr>
+          <w:p>
+            <w:pPr>
+              <w:spacing w:before="0" w:after="0" w:line="252" w:lineRule="auto"/>
+            </w:pPr>
+            <w:r>
+              <w:rPr>
+                <w:sz w:val="17"/>
+              </w:rPr>
+              <w:t>可复盘的阶段结论</w:t>
+            </w:r>
+          </w:p>
+        </w:tc>
+      </w:tr>
+    </w:tbl>
+    <w:p>
+      <w:pPr>
+        <w:keepLines w:val="0"/>
+      </w:pPr>
+      <w:r>
+        <w:t>安装依赖并确认本地模型服务：</w:t>
+      </w:r>
+    </w:p>
+    <w:p>
+      <w:pPr>
+        <w:spacing w:before="40" w:after="100" w:line="240" w:lineRule="auto"/>
+        <w:ind w:left="200" w:right="200"/>
+        <w:shd w:fill="F2F4F7"/>
+      </w:pPr>
+      <w:r>
+        <w:rPr>
+          <w:rFonts w:ascii="Consolas" w:hAnsi="Consolas" w:eastAsia="等线"/>
+          <w:sz w:val="16"/>
+        </w:rPr>
+        <w:t>python -m pip install -r requirements.txt</w:t>
+        <w:br/>
+        <w:t>ollama pull qwen2.5vl:7b</w:t>
+        <w:br/>
+        <w:t>ollama serve</w:t>
+      </w:r>
+    </w:p>
+    <w:p>
+      <w:pPr>
+        <w:keepLines w:val="0"/>
+      </w:pPr>
+      <w:r>
+        <w:t>从 Label Studio 构建人体检测 benchmark：</w:t>
+      </w:r>
+    </w:p>
+    <w:p>
+      <w:pPr>
+        <w:spacing w:before="40" w:after="100" w:line="240" w:lineRule="auto"/>
+        <w:ind w:left="200" w:right="200"/>
+        <w:shd w:fill="F2F4F7"/>
+      </w:pPr>
+      <w:r>
+        <w:rPr>
+          <w:rFonts w:ascii="Consolas" w:hAnsi="Consolas" w:eastAsia="等线"/>
+          <w:sz w:val="16"/>
+        </w:rPr>
+        <w:t>python scripts/build_person_detection_benchmark.py --base-url http://&lt;label-studio-host&gt;:8080 --output-dir data/benchmarks/person_labelstudio</w:t>
+      </w:r>
+    </w:p>
+    <w:p>
+      <w:pPr>
+        <w:pStyle w:val="a0"/>
+        <w:keepLines w:val="0"/>
+      </w:pPr>
+      <w:r>
+        <w:t>账号和密码通过 LABEL_STUDIO_USERNAME、LABEL_STUDIO_PASSWORD 环境变量提供，不要写入代码或提交到 Git。</w:t>
+      </w:r>
+    </w:p>
+    <w:p>
+      <w:pPr>
+        <w:keepLines w:val="0"/>
+      </w:pPr>
+      <w:r>
+        <w:t>评估已有预测基线：</w:t>
+      </w:r>
+    </w:p>
+    <w:p>
+      <w:pPr>
+        <w:spacing w:before="40" w:after="100" w:line="240" w:lineRule="auto"/>
+        <w:ind w:left="200" w:right="200"/>
+        <w:shd w:fill="F2F4F7"/>
+      </w:pPr>
+      <w:r>
+        <w:rPr>
+          <w:rFonts w:ascii="Consolas" w:hAnsi="Consolas" w:eastAsia="等线"/>
+          <w:sz w:val="16"/>
+        </w:rPr>
+        <w:t>python scripts/evaluate_person_detection_benchmark.py --benchmark data/benchmarks/person_labelstudio/person_detection_benchmark.json --output data/benchmarks/person_labelstudio/evaluation.json</w:t>
+      </w:r>
+    </w:p>
+    <w:p>
+      <w:pPr>
+        <w:keepLines w:val="0"/>
+      </w:pPr>
+      <w:r>
+        <w:t>运行本地 Ollama 模型的小规模对齐测试：</w:t>
+      </w:r>
+    </w:p>
+    <w:p>
+      <w:pPr>
+        <w:spacing w:before="40" w:after="100" w:line="240" w:lineRule="auto"/>
+        <w:ind w:left="200" w:right="200"/>
+        <w:shd w:fill="F2F4F7"/>
+      </w:pPr>
+      <w:r>
+        <w:rPr>
+          <w:rFonts w:ascii="Consolas" w:hAnsi="Consolas" w:eastAsia="等线"/>
+          <w:sz w:val="16"/>
+        </w:rPr>
+        <w:t>python scripts/run_ollama_person_benchmark.py --benchmark data/benchmarks/person_labelstudio/person_detection_benchmark.json --output-dir data/benchmarks/person_labelstudio/ollama_eval_qwen25vl7b --model qwen2.5vl:7b --limit 20 --no-tiles</w:t>
+      </w:r>
+    </w:p>
+    <w:p>
+      <w:pPr>
+        <w:pStyle w:val="a0"/>
+        <w:keepLines w:val="0"/>
+      </w:pPr>
+      <w:r>
+        <w:t>首轮建议固定 compact 模式、request_image_max_side=1280、关闭 tile，并保留默认 resume/checkpoint。首轮稳定后再扩大到 100/500 张，或单独比较 full-frame 与 full-frame + tiles。</w:t>
+      </w:r>
+    </w:p>
+    <w:p>
+      <w:pPr>
+        <w:pStyle w:val="21"/>
+        <w:keepNext/>
+        <w:keepLines w:val="0"/>
+      </w:pPr>
+      <w:r>
+        <w:t>7.2 性能对齐方法</w:t>
+      </w:r>
+    </w:p>
+    <w:tbl>
+      <w:tblPr>
+        <w:tblStyle w:val="aff1"/>
+        <w:tblW w:type="auto" w:w="0"/>
+        <w:tblLayout w:type="fixed"/>
+        <w:tblLook w:firstColumn="1" w:firstRow="1" w:lastColumn="0" w:lastRow="0" w:noHBand="0" w:noVBand="1" w:val="04A0"/>
+      </w:tblPr>
+      <w:tblGrid>
+        <w:gridCol w:w="3312"/>
+        <w:gridCol w:w="3312"/>
+        <w:gridCol w:w="3312"/>
+      </w:tblGrid>
+      <w:tr>
+        <w:trPr>
+          <w:tblHeader w:val="true"/>
+        </w:trPr>
+        <w:tc>
+          <w:tcPr>
+            <w:tcW w:type="dxa" w:w="1260"/>
+            <w:vAlign w:val="center"/>
+            <w:tcMar>
+              <w:top w:w="90" w:type="dxa"/>
+              <w:start w:w="110" w:type="dxa"/>
+              <w:bottom w:w="90" w:type="dxa"/>
+              <w:end w:w="110" w:type="dxa"/>
+            </w:tcMar>
+            <w:shd w:fill="D9EAF7"/>
+          </w:tcPr>
+          <w:p>
+            <w:pPr>
+              <w:spacing w:before="0" w:after="0" w:line="252" w:lineRule="auto"/>
+            </w:pPr>
+            <w:r>
+              <w:rPr>
+                <w:b/>
+                <w:sz w:val="17"/>
+              </w:rPr>
+              <w:t>对齐维度</w:t>
+            </w:r>
+          </w:p>
+        </w:tc>
+        <w:tc>
+          <w:tcPr>
+            <w:tcW w:type="dxa" w:w="5669"/>
+            <w:vAlign w:val="center"/>
+            <w:tcMar>
+              <w:top w:w="90" w:type="dxa"/>
+              <w:start w:w="110" w:type="dxa"/>
+              <w:bottom w:w="90" w:type="dxa"/>
+              <w:end w:w="110" w:type="dxa"/>
+            </w:tcMar>
+            <w:shd w:fill="D9EAF7"/>
+          </w:tcPr>
+          <w:p>
+            <w:pPr>
+              <w:spacing w:before="0" w:after="0" w:line="252" w:lineRule="auto"/>
+            </w:pPr>
+            <w:r>
+              <w:rPr>
+                <w:b/>
+                <w:sz w:val="17"/>
+              </w:rPr>
+              <w:t>固定规则</w:t>
+            </w:r>
+          </w:p>
+        </w:tc>
+        <w:tc>
+          <w:tcPr>
+            <w:tcW w:type="dxa" w:w="2283"/>
+            <w:vAlign w:val="center"/>
+            <w:tcMar>
+              <w:top w:w="90" w:type="dxa"/>
+              <w:start w:w="110" w:type="dxa"/>
+              <w:bottom w:w="90" w:type="dxa"/>
+              <w:end w:w="110" w:type="dxa"/>
+            </w:tcMar>
+            <w:shd w:fill="D9EAF7"/>
+          </w:tcPr>
+          <w:p>
+            <w:pPr>
+              <w:spacing w:before="0" w:after="0" w:line="252" w:lineRule="auto"/>
+            </w:pPr>
+            <w:r>
+              <w:rPr>
+                <w:b/>
+                <w:sz w:val="17"/>
+              </w:rPr>
+              <w:t>目的</w:t>
+            </w:r>
+          </w:p>
+        </w:tc>
+      </w:tr>
+      <w:tr>
+        <w:tc>
+          <w:tcPr>
+            <w:tcW w:type="dxa" w:w="1260"/>
+            <w:vAlign w:val="center"/>
+            <w:tcMar>
+              <w:top w:w="90" w:type="dxa"/>
+              <w:start w:w="110" w:type="dxa"/>
+              <w:bottom w:w="90" w:type="dxa"/>
+              <w:end w:w="110" w:type="dxa"/>
+            </w:tcMar>
+          </w:tcPr>
+          <w:p>
+            <w:pPr>
+              <w:spacing w:before="0" w:after="0" w:line="252" w:lineRule="auto"/>
+              <w:jc w:val="center"/>
+            </w:pPr>
+            <w:r>
+              <w:rPr>
+                <w:sz w:val="17"/>
+              </w:rPr>
+              <w:t>数据</w:t>
+            </w:r>
+          </w:p>
+        </w:tc>
+        <w:tc>
+          <w:tcPr>
+            <w:tcW w:type="dxa" w:w="5669"/>
+            <w:vAlign w:val="center"/>
+            <w:tcMar>
+              <w:top w:w="90" w:type="dxa"/>
+              <w:start w:w="110" w:type="dxa"/>
+              <w:bottom w:w="90" w:type="dxa"/>
+              <w:end w:w="110" w:type="dxa"/>
+            </w:tcMar>
+          </w:tcPr>
+          <w:p>
+            <w:pPr>
+              <w:spacing w:before="0" w:after="0" w:line="252" w:lineRule="auto"/>
+            </w:pPr>
+            <w:r>
+              <w:rPr>
+                <w:sz w:val="17"/>
+              </w:rPr>
+              <w:t>固定 benchmark 文件、抽样 seed、项目分布和人工标注版本；正式统计排除 pseudo-GT。</w:t>
+            </w:r>
+          </w:p>
+        </w:tc>
+        <w:tc>
+          <w:tcPr>
+            <w:tcW w:type="dxa" w:w="2283"/>
+            <w:vAlign w:val="center"/>
+            <w:tcMar>
+              <w:top w:w="90" w:type="dxa"/>
+              <w:start w:w="110" w:type="dxa"/>
+              <w:bottom w:w="90" w:type="dxa"/>
+              <w:end w:w="110" w:type="dxa"/>
+            </w:tcMar>
+          </w:tcPr>
+          <w:p>
+            <w:pPr>
+              <w:spacing w:before="0" w:after="0" w:line="252" w:lineRule="auto"/>
+            </w:pPr>
+            <w:r>
+              <w:rPr>
+                <w:sz w:val="17"/>
+              </w:rPr>
+              <w:t>避免样本变化造成虚假提升</w:t>
+            </w:r>
+          </w:p>
+        </w:tc>
+      </w:tr>
+      <w:tr>
+        <w:tc>
+          <w:tcPr>
+            <w:tcW w:type="dxa" w:w="1260"/>
+            <w:vAlign w:val="center"/>
+            <w:tcMar>
+              <w:top w:w="90" w:type="dxa"/>
+              <w:start w:w="110" w:type="dxa"/>
+              <w:bottom w:w="90" w:type="dxa"/>
+              <w:end w:w="110" w:type="dxa"/>
+            </w:tcMar>
+          </w:tcPr>
+          <w:p>
+            <w:pPr>
+              <w:spacing w:before="0" w:after="0" w:line="252" w:lineRule="auto"/>
+              <w:jc w:val="center"/>
+            </w:pPr>
+            <w:r>
+              <w:rPr>
+                <w:sz w:val="17"/>
+              </w:rPr>
+              <w:t>模型</w:t>
+            </w:r>
+          </w:p>
+        </w:tc>
+        <w:tc>
+          <w:tcPr>
+            <w:tcW w:type="dxa" w:w="5669"/>
+            <w:vAlign w:val="center"/>
+            <w:tcMar>
+              <w:top w:w="90" w:type="dxa"/>
+              <w:start w:w="110" w:type="dxa"/>
+              <w:bottom w:w="90" w:type="dxa"/>
+              <w:end w:w="110" w:type="dxa"/>
+            </w:tcMar>
+          </w:tcPr>
+          <w:p>
+            <w:pPr>
+              <w:spacing w:before="0" w:after="0" w:line="252" w:lineRule="auto"/>
+            </w:pPr>
+            <w:r>
+              <w:rPr>
+                <w:sz w:val="17"/>
+              </w:rPr>
+              <w:t>记录模型名、模型版本、Ollama/API 地址和运行时间。</w:t>
+            </w:r>
+          </w:p>
+        </w:tc>
+        <w:tc>
+          <w:tcPr>
+            <w:tcW w:type="dxa" w:w="2283"/>
+            <w:vAlign w:val="center"/>
+            <w:tcMar>
+              <w:top w:w="90" w:type="dxa"/>
+              <w:start w:w="110" w:type="dxa"/>
+              <w:bottom w:w="90" w:type="dxa"/>
+              <w:end w:w="110" w:type="dxa"/>
+            </w:tcMar>
+          </w:tcPr>
+          <w:p>
+            <w:pPr>
+              <w:spacing w:before="0" w:after="0" w:line="252" w:lineRule="auto"/>
+            </w:pPr>
+            <w:r>
+              <w:rPr>
+                <w:sz w:val="17"/>
+              </w:rPr>
+              <w:t>保证结果可追溯</w:t>
+            </w:r>
+          </w:p>
+        </w:tc>
+      </w:tr>
+      <w:tr>
+        <w:tc>
+          <w:tcPr>
+            <w:tcW w:type="dxa" w:w="1260"/>
+            <w:vAlign w:val="center"/>
+            <w:tcMar>
+              <w:top w:w="90" w:type="dxa"/>
+              <w:start w:w="110" w:type="dxa"/>
+              <w:bottom w:w="90" w:type="dxa"/>
+              <w:end w:w="110" w:type="dxa"/>
+            </w:tcMar>
+          </w:tcPr>
+          <w:p>
+            <w:pPr>
+              <w:spacing w:before="0" w:after="0" w:line="252" w:lineRule="auto"/>
+              <w:jc w:val="center"/>
+            </w:pPr>
+            <w:r>
+              <w:rPr>
+                <w:sz w:val="17"/>
+              </w:rPr>
+              <w:t>输入</w:t>
+            </w:r>
+          </w:p>
+        </w:tc>
+        <w:tc>
+          <w:tcPr>
+            <w:tcW w:type="dxa" w:w="5669"/>
+            <w:vAlign w:val="center"/>
+            <w:tcMar>
+              <w:top w:w="90" w:type="dxa"/>
+              <w:start w:w="110" w:type="dxa"/>
+              <w:bottom w:w="90" w:type="dxa"/>
+              <w:end w:w="110" w:type="dxa"/>
+            </w:tcMar>
+          </w:tcPr>
+          <w:p>
+            <w:pPr>
+              <w:spacing w:before="0" w:after="0" w:line="252" w:lineRule="auto"/>
+            </w:pPr>
+            <w:r>
+              <w:rPr>
+                <w:sz w:val="17"/>
+              </w:rPr>
+              <w:t>固定 request_image_max_side=1280、图片缓存和主/备用图片地址。</w:t>
+            </w:r>
+          </w:p>
+        </w:tc>
+        <w:tc>
+          <w:tcPr>
+            <w:tcW w:type="dxa" w:w="2283"/>
+            <w:vAlign w:val="center"/>
+            <w:tcMar>
+              <w:top w:w="90" w:type="dxa"/>
+              <w:start w:w="110" w:type="dxa"/>
+              <w:bottom w:w="90" w:type="dxa"/>
+              <w:end w:w="110" w:type="dxa"/>
+            </w:tcMar>
+          </w:tcPr>
+          <w:p>
+            <w:pPr>
+              <w:spacing w:before="0" w:after="0" w:line="252" w:lineRule="auto"/>
+            </w:pPr>
+            <w:r>
+              <w:rPr>
+                <w:sz w:val="17"/>
+              </w:rPr>
+              <w:t>避免坐标尺度和下载失败干扰</w:t>
+            </w:r>
+          </w:p>
+        </w:tc>
+      </w:tr>
+      <w:tr>
+        <w:tc>
+          <w:tcPr>
+            <w:tcW w:type="dxa" w:w="1260"/>
+            <w:vAlign w:val="center"/>
+            <w:tcMar>
+              <w:top w:w="90" w:type="dxa"/>
+              <w:start w:w="110" w:type="dxa"/>
+              <w:bottom w:w="90" w:type="dxa"/>
+              <w:end w:w="110" w:type="dxa"/>
+            </w:tcMar>
+          </w:tcPr>
+          <w:p>
+            <w:pPr>
+              <w:spacing w:before="0" w:after="0" w:line="252" w:lineRule="auto"/>
+              <w:jc w:val="center"/>
+            </w:pPr>
+            <w:r>
+              <w:rPr>
+                <w:sz w:val="17"/>
+              </w:rPr>
+              <w:t>提示与解析</w:t>
+            </w:r>
+          </w:p>
+        </w:tc>
+        <w:tc>
+          <w:tcPr>
+            <w:tcW w:type="dxa" w:w="5669"/>
+            <w:vAlign w:val="center"/>
+            <w:tcMar>
+              <w:top w:w="90" w:type="dxa"/>
+              <w:start w:w="110" w:type="dxa"/>
+              <w:bottom w:w="90" w:type="dxa"/>
+              <w:end w:w="110" w:type="dxa"/>
+            </w:tcMar>
+          </w:tcPr>
+          <w:p>
+            <w:pPr>
+              <w:spacing w:before="0" w:after="0" w:line="252" w:lineRule="auto"/>
+            </w:pPr>
+            <w:r>
+              <w:rPr>
+                <w:sz w:val="17"/>
+              </w:rPr>
+              <w:t>固定 compact bbox schema、解析器版本及失败重试策略。</w:t>
+            </w:r>
+          </w:p>
+        </w:tc>
+        <w:tc>
+          <w:tcPr>
+            <w:tcW w:type="dxa" w:w="2283"/>
+            <w:vAlign w:val="center"/>
+            <w:tcMar>
+              <w:top w:w="90" w:type="dxa"/>
+              <w:start w:w="110" w:type="dxa"/>
+              <w:bottom w:w="90" w:type="dxa"/>
+              <w:end w:w="110" w:type="dxa"/>
+            </w:tcMar>
+          </w:tcPr>
+          <w:p>
+            <w:pPr>
+              <w:spacing w:before="0" w:after="0" w:line="252" w:lineRule="auto"/>
+            </w:pPr>
+            <w:r>
+              <w:rPr>
+                <w:sz w:val="17"/>
+              </w:rPr>
+              <w:t>避免格式失败被误判为漏检</w:t>
+            </w:r>
+          </w:p>
+        </w:tc>
+      </w:tr>
+      <w:tr>
+        <w:tc>
+          <w:tcPr>
+            <w:tcW w:type="dxa" w:w="1260"/>
+            <w:vAlign w:val="center"/>
+            <w:tcMar>
+              <w:top w:w="90" w:type="dxa"/>
+              <w:start w:w="110" w:type="dxa"/>
+              <w:bottom w:w="90" w:type="dxa"/>
+              <w:end w:w="110" w:type="dxa"/>
+            </w:tcMar>
+          </w:tcPr>
+          <w:p>
+            <w:pPr>
+              <w:spacing w:before="0" w:after="0" w:line="252" w:lineRule="auto"/>
+              <w:jc w:val="center"/>
+            </w:pPr>
+            <w:r>
+              <w:rPr>
+                <w:sz w:val="17"/>
+              </w:rPr>
+              <w:t>检测策略</w:t>
+            </w:r>
+          </w:p>
+        </w:tc>
+        <w:tc>
+          <w:tcPr>
+            <w:tcW w:type="dxa" w:w="5669"/>
+            <w:vAlign w:val="center"/>
+            <w:tcMar>
+              <w:top w:w="90" w:type="dxa"/>
+              <w:start w:w="110" w:type="dxa"/>
+              <w:bottom w:w="90" w:type="dxa"/>
+              <w:end w:w="110" w:type="dxa"/>
+            </w:tcMar>
+          </w:tcPr>
+          <w:p>
+            <w:pPr>
+              <w:spacing w:before="0" w:after="0" w:line="252" w:lineRule="auto"/>
+            </w:pPr>
+            <w:r>
+              <w:rPr>
+                <w:sz w:val="17"/>
+              </w:rPr>
+              <w:t>分别报告无 tile 与启用 tile 的结果；固定 overlap、tile 尺寸及 NMS 阈值。</w:t>
+            </w:r>
+          </w:p>
+        </w:tc>
+        <w:tc>
+          <w:tcPr>
+            <w:tcW w:type="dxa" w:w="2283"/>
+            <w:vAlign w:val="center"/>
+            <w:tcMar>
+              <w:top w:w="90" w:type="dxa"/>
+              <w:start w:w="110" w:type="dxa"/>
+              <w:bottom w:w="90" w:type="dxa"/>
+              <w:end w:w="110" w:type="dxa"/>
+            </w:tcMar>
+          </w:tcPr>
+          <w:p>
+            <w:pPr>
+              <w:spacing w:before="0" w:after="0" w:line="252" w:lineRule="auto"/>
+            </w:pPr>
+            <w:r>
+              <w:rPr>
+                <w:sz w:val="17"/>
+              </w:rPr>
+              <w:t>区分模型能力与多尺度策略收益</w:t>
+            </w:r>
+          </w:p>
+        </w:tc>
+      </w:tr>
+      <w:tr>
+        <w:tc>
+          <w:tcPr>
+            <w:tcW w:type="dxa" w:w="1260"/>
+            <w:vAlign w:val="center"/>
+            <w:tcMar>
+              <w:top w:w="90" w:type="dxa"/>
+              <w:start w:w="110" w:type="dxa"/>
+              <w:bottom w:w="90" w:type="dxa"/>
+              <w:end w:w="110" w:type="dxa"/>
+            </w:tcMar>
+          </w:tcPr>
+          <w:p>
+            <w:pPr>
+              <w:spacing w:before="0" w:after="0" w:line="252" w:lineRule="auto"/>
+              <w:jc w:val="center"/>
+            </w:pPr>
+            <w:r>
+              <w:rPr>
+                <w:sz w:val="17"/>
+              </w:rPr>
+              <w:t>指标</w:t>
+            </w:r>
+          </w:p>
+        </w:tc>
+        <w:tc>
+          <w:tcPr>
+            <w:tcW w:type="dxa" w:w="5669"/>
+            <w:vAlign w:val="center"/>
+            <w:tcMar>
+              <w:top w:w="90" w:type="dxa"/>
+              <w:start w:w="110" w:type="dxa"/>
+              <w:bottom w:w="90" w:type="dxa"/>
+              <w:end w:w="110" w:type="dxa"/>
+            </w:tcMar>
+          </w:tcPr>
+          <w:p>
+            <w:pPr>
+              <w:spacing w:before="0" w:after="0" w:line="252" w:lineRule="auto"/>
+            </w:pPr>
+            <w:r>
+              <w:rPr>
+                <w:sz w:val="17"/>
+              </w:rPr>
+              <w:t>同时报告样本数、GT/Pred、失败数、P/R/F1@0.50、P/R/F1@0.75、Mean Matched IoU。</w:t>
+            </w:r>
+          </w:p>
+        </w:tc>
+        <w:tc>
+          <w:tcPr>
+            <w:tcW w:type="dxa" w:w="2283"/>
+            <w:vAlign w:val="center"/>
+            <w:tcMar>
+              <w:top w:w="90" w:type="dxa"/>
+              <w:start w:w="110" w:type="dxa"/>
+              <w:bottom w:w="90" w:type="dxa"/>
+              <w:end w:w="110" w:type="dxa"/>
+            </w:tcMar>
+          </w:tcPr>
+          <w:p>
+            <w:pPr>
+              <w:spacing w:before="0" w:after="0" w:line="252" w:lineRule="auto"/>
+            </w:pPr>
+            <w:r>
+              <w:rPr>
+                <w:sz w:val="17"/>
+              </w:rPr>
+              <w:t>兼顾召回和框定位质量</w:t>
+            </w:r>
+          </w:p>
+        </w:tc>
+      </w:tr>
+      <w:tr>
+        <w:tc>
+          <w:tcPr>
+            <w:tcW w:type="dxa" w:w="1260"/>
+            <w:vAlign w:val="center"/>
+            <w:tcMar>
+              <w:top w:w="90" w:type="dxa"/>
+              <w:start w:w="110" w:type="dxa"/>
+              <w:bottom w:w="90" w:type="dxa"/>
+              <w:end w:w="110" w:type="dxa"/>
+            </w:tcMar>
+          </w:tcPr>
+          <w:p>
+            <w:pPr>
+              <w:spacing w:before="0" w:after="0" w:line="252" w:lineRule="auto"/>
+              <w:jc w:val="center"/>
+            </w:pPr>
+            <w:r>
+              <w:rPr>
+                <w:sz w:val="17"/>
+              </w:rPr>
+              <w:t>人工复核</w:t>
+            </w:r>
+          </w:p>
+        </w:tc>
+        <w:tc>
+          <w:tcPr>
+            <w:tcW w:type="dxa" w:w="5669"/>
+            <w:vAlign w:val="center"/>
+            <w:tcMar>
+              <w:top w:w="90" w:type="dxa"/>
+              <w:start w:w="110" w:type="dxa"/>
+              <w:bottom w:w="90" w:type="dxa"/>
+              <w:end w:w="110" w:type="dxa"/>
+            </w:tcMar>
+          </w:tcPr>
+          <w:p>
+            <w:pPr>
+              <w:spacing w:before="0" w:after="0" w:line="252" w:lineRule="auto"/>
+            </w:pPr>
+            <w:r>
+              <w:rPr>
+                <w:sz w:val="17"/>
+              </w:rPr>
+              <w:t>按小目标、遮挡、跌倒姿态、边缘截断、多人和低对比度分类复核 FN/FP。</w:t>
+            </w:r>
+          </w:p>
+        </w:tc>
+        <w:tc>
+          <w:tcPr>
+            <w:tcW w:type="dxa" w:w="2283"/>
+            <w:vAlign w:val="center"/>
+            <w:tcMar>
+              <w:top w:w="90" w:type="dxa"/>
+              <w:start w:w="110" w:type="dxa"/>
+              <w:bottom w:w="90" w:type="dxa"/>
+              <w:end w:w="110" w:type="dxa"/>
+            </w:tcMar>
+          </w:tcPr>
+          <w:p>
+            <w:pPr>
+              <w:spacing w:before="0" w:after="0" w:line="252" w:lineRule="auto"/>
+            </w:pPr>
+            <w:r>
+              <w:rPr>
+                <w:sz w:val="17"/>
+              </w:rPr>
+              <w:t>解释指标变化并形成改进闭环</w:t>
+            </w:r>
+          </w:p>
+        </w:tc>
+      </w:tr>
+    </w:tbl>
+    <w:p>
+      <w:pPr>
+        <w:pStyle w:val="a0"/>
+        <w:keepLines w:val="0"/>
+      </w:pPr>
+      <w:r>
+        <w:t>正式对比时，先检查 failure_count。图片下载超时、Ollama 502、JSON 无法解析等运行失败必须单独报告，不能计入模型质量分数，也不能把失败样本当作“图中无人”。</w:t>
+      </w:r>
+    </w:p>
+    <w:p>
+      <w:pPr>
+        <w:pStyle w:val="a0"/>
+        <w:keepLines w:val="0"/>
+      </w:pPr>
+      <w:r>
+        <w:t>evaluate_person_detection_benchmark.py 当前提供固定 IoU 阈值下的 Precision、Recall、F1 和 Mean Matched IoU；它不是完整 COCO mAP 实现。对外汇报时应使用准确指标名称。</w:t>
+      </w:r>
+    </w:p>
+    <w:p>
+      <w:pPr>
+        <w:pStyle w:val="21"/>
+        <w:keepNext/>
+        <w:keepLines w:val="0"/>
+      </w:pPr>
+      <w:r>
+        <w:t>7.3 当前性能</w:t>
+      </w:r>
+    </w:p>
+    <w:p>
+      <w:pPr>
+        <w:keepLines w:val="0"/>
+      </w:pPr>
+      <w:r>
+        <w:t>以下数据来自 2026-07-06 至 2026-07-18 的历史 benchmark 记录。结果文件未纳入本次五文件交付，接手后应按上节命令重新构建数据并复现。</w:t>
+      </w:r>
+    </w:p>
+    <w:tbl>
+      <w:tblPr>
+        <w:tblStyle w:val="aff1"/>
+        <w:tblW w:type="auto" w:w="0"/>
+        <w:tblLayout w:type="fixed"/>
+        <w:tblLook w:firstColumn="1" w:firstRow="1" w:lastColumn="0" w:lastRow="0" w:noHBand="0" w:noVBand="1" w:val="04A0"/>
+      </w:tblPr>
+      <w:tblGrid>
+        <w:gridCol w:w="1656"/>
+        <w:gridCol w:w="1656"/>
+        <w:gridCol w:w="1656"/>
+        <w:gridCol w:w="1656"/>
+        <w:gridCol w:w="1656"/>
+        <w:gridCol w:w="1656"/>
+      </w:tblGrid>
+      <w:tr>
+        <w:trPr>
+          <w:tblHeader w:val="true"/>
+        </w:trPr>
+        <w:tc>
+          <w:tcPr>
+            <w:tcW w:type="dxa" w:w="1890"/>
+            <w:vAlign w:val="center"/>
+            <w:tcMar>
+              <w:top w:w="90" w:type="dxa"/>
+              <w:start w:w="110" w:type="dxa"/>
+              <w:bottom w:w="90" w:type="dxa"/>
+              <w:end w:w="110" w:type="dxa"/>
+            </w:tcMar>
+            <w:shd w:fill="D9EAF7"/>
+          </w:tcPr>
+          <w:p>
+            <w:pPr>
+              <w:spacing w:before="0" w:after="0" w:line="252" w:lineRule="auto"/>
+            </w:pPr>
+            <w:r>
+              <w:rPr>
+                <w:b/>
+                <w:sz w:val="17"/>
+              </w:rPr>
+              <w:t>方案</w:t>
+            </w:r>
+          </w:p>
+        </w:tc>
+        <w:tc>
+          <w:tcPr>
+            <w:tcW w:type="dxa" w:w="2283"/>
+            <w:vAlign w:val="center"/>
+            <w:tcMar>
+              <w:top w:w="90" w:type="dxa"/>
+              <w:start w:w="110" w:type="dxa"/>
+              <w:bottom w:w="90" w:type="dxa"/>
+              <w:end w:w="110" w:type="dxa"/>
+            </w:tcMar>
+            <w:shd w:fill="D9EAF7"/>
+          </w:tcPr>
+          <w:p>
+            <w:pPr>
+              <w:spacing w:before="0" w:after="0" w:line="252" w:lineRule="auto"/>
+            </w:pPr>
+            <w:r>
+              <w:rPr>
+                <w:b/>
+                <w:sz w:val="17"/>
+              </w:rPr>
+              <w:t>评测规模</w:t>
+            </w:r>
+          </w:p>
+        </w:tc>
+        <w:tc>
+          <w:tcPr>
+            <w:tcW w:type="dxa" w:w="630"/>
+            <w:vAlign w:val="center"/>
+            <w:tcMar>
+              <w:top w:w="90" w:type="dxa"/>
+              <w:start w:w="110" w:type="dxa"/>
+              <w:bottom w:w="90" w:type="dxa"/>
+              <w:end w:w="110" w:type="dxa"/>
+            </w:tcMar>
+            <w:shd w:fill="D9EAF7"/>
+          </w:tcPr>
+          <w:p>
+            <w:pPr>
+              <w:spacing w:before="0" w:after="0" w:line="252" w:lineRule="auto"/>
+            </w:pPr>
+            <w:r>
+              <w:rPr>
+                <w:b/>
+                <w:sz w:val="17"/>
+              </w:rPr>
+              <w:t>IoU</w:t>
+            </w:r>
+          </w:p>
+        </w:tc>
+        <w:tc>
+          <w:tcPr>
+            <w:tcW w:type="dxa" w:w="1496"/>
+            <w:vAlign w:val="center"/>
+            <w:tcMar>
+              <w:top w:w="90" w:type="dxa"/>
+              <w:start w:w="110" w:type="dxa"/>
+              <w:bottom w:w="90" w:type="dxa"/>
+              <w:end w:w="110" w:type="dxa"/>
+            </w:tcMar>
+            <w:shd w:fill="D9EAF7"/>
+          </w:tcPr>
+          <w:p>
+            <w:pPr>
+              <w:spacing w:before="0" w:after="0" w:line="252" w:lineRule="auto"/>
+            </w:pPr>
+            <w:r>
+              <w:rPr>
+                <w:b/>
+                <w:sz w:val="17"/>
+              </w:rPr>
+              <w:t>P / R / F1</w:t>
+            </w:r>
+          </w:p>
+        </w:tc>
+        <w:tc>
+          <w:tcPr>
+            <w:tcW w:type="dxa" w:w="1102"/>
+            <w:vAlign w:val="center"/>
+            <w:tcMar>
+              <w:top w:w="90" w:type="dxa"/>
+              <w:start w:w="110" w:type="dxa"/>
+              <w:bottom w:w="90" w:type="dxa"/>
+              <w:end w:w="110" w:type="dxa"/>
+            </w:tcMar>
+            <w:shd w:fill="D9EAF7"/>
+          </w:tcPr>
+          <w:p>
+            <w:pPr>
+              <w:spacing w:before="0" w:after="0" w:line="252" w:lineRule="auto"/>
+            </w:pPr>
+            <w:r>
+              <w:rPr>
+                <w:b/>
+                <w:sz w:val="17"/>
+              </w:rPr>
+              <w:t>匹配 IoU</w:t>
+            </w:r>
+          </w:p>
+        </w:tc>
+        <w:tc>
+          <w:tcPr>
+            <w:tcW w:type="dxa" w:w="1811"/>
+            <w:vAlign w:val="center"/>
+            <w:tcMar>
+              <w:top w:w="90" w:type="dxa"/>
+              <w:start w:w="110" w:type="dxa"/>
+              <w:bottom w:w="90" w:type="dxa"/>
+              <w:end w:w="110" w:type="dxa"/>
+            </w:tcMar>
+            <w:shd w:fill="D9EAF7"/>
+          </w:tcPr>
+          <w:p>
+            <w:pPr>
+              <w:spacing w:before="0" w:after="0" w:line="252" w:lineRule="auto"/>
+            </w:pPr>
+            <w:r>
+              <w:rPr>
+                <w:b/>
+                <w:sz w:val="17"/>
+              </w:rPr>
+              <w:t>结论</w:t>
+            </w:r>
+          </w:p>
+        </w:tc>
+      </w:tr>
+      <w:tr>
+        <w:tc>
+          <w:tcPr>
+            <w:tcW w:type="dxa" w:w="1890"/>
+            <w:vAlign w:val="center"/>
+            <w:tcMar>
+              <w:top w:w="90" w:type="dxa"/>
+              <w:start w:w="110" w:type="dxa"/>
+              <w:bottom w:w="90" w:type="dxa"/>
+              <w:end w:w="110" w:type="dxa"/>
+            </w:tcMar>
+          </w:tcPr>
+          <w:p>
+            <w:pPr>
+              <w:spacing w:before="0" w:after="0" w:line="252" w:lineRule="auto"/>
+              <w:jc w:val="center"/>
+            </w:pPr>
+            <w:r>
+              <w:rPr>
+                <w:sz w:val="17"/>
+              </w:rPr>
+              <w:t>已有服务器 prediction 基线</w:t>
+            </w:r>
+          </w:p>
+        </w:tc>
+        <w:tc>
+          <w:tcPr>
+            <w:tcW w:type="dxa" w:w="2283"/>
+            <w:vAlign w:val="center"/>
+            <w:tcMar>
+              <w:top w:w="90" w:type="dxa"/>
+              <w:start w:w="110" w:type="dxa"/>
+              <w:bottom w:w="90" w:type="dxa"/>
+              <w:end w:w="110" w:type="dxa"/>
+            </w:tcMar>
+          </w:tcPr>
+          <w:p>
+            <w:pPr>
+              <w:spacing w:before="0" w:after="0" w:line="252" w:lineRule="auto"/>
+            </w:pPr>
+            <w:r>
+              <w:rPr>
+                <w:sz w:val="17"/>
+              </w:rPr>
+              <w:t>1914 张人工标注样本；2795 GT；2166 Pred</w:t>
+            </w:r>
+          </w:p>
+        </w:tc>
+        <w:tc>
+          <w:tcPr>
+            <w:tcW w:type="dxa" w:w="630"/>
+            <w:vAlign w:val="center"/>
+            <w:tcMar>
+              <w:top w:w="90" w:type="dxa"/>
+              <w:start w:w="110" w:type="dxa"/>
+              <w:bottom w:w="90" w:type="dxa"/>
+              <w:end w:w="110" w:type="dxa"/>
+            </w:tcMar>
+          </w:tcPr>
+          <w:p>
+            <w:pPr>
+              <w:spacing w:before="0" w:after="0" w:line="252" w:lineRule="auto"/>
+            </w:pPr>
+            <w:r>
+              <w:rPr>
+                <w:sz w:val="17"/>
+              </w:rPr>
+              <w:t>0.50 / 0.75</w:t>
+            </w:r>
+          </w:p>
+        </w:tc>
+        <w:tc>
+          <w:tcPr>
+            <w:tcW w:type="dxa" w:w="1496"/>
+            <w:vAlign w:val="center"/>
+            <w:tcMar>
+              <w:top w:w="90" w:type="dxa"/>
+              <w:start w:w="110" w:type="dxa"/>
+              <w:bottom w:w="90" w:type="dxa"/>
+              <w:end w:w="110" w:type="dxa"/>
+            </w:tcMar>
+          </w:tcPr>
+          <w:p>
+            <w:pPr>
+              <w:spacing w:before="0" w:after="0" w:line="252" w:lineRule="auto"/>
+            </w:pPr>
+            <w:r>
+              <w:rPr>
+                <w:sz w:val="17"/>
+              </w:rPr>
+              <w:t>0.999 / 0.774 / 0.872</w:t>
+            </w:r>
+          </w:p>
+        </w:tc>
+        <w:tc>
+          <w:tcPr>
+            <w:tcW w:type="dxa" w:w="1102"/>
+            <w:vAlign w:val="center"/>
+            <w:tcMar>
+              <w:top w:w="90" w:type="dxa"/>
+              <w:start w:w="110" w:type="dxa"/>
+              <w:bottom w:w="90" w:type="dxa"/>
+              <w:end w:w="110" w:type="dxa"/>
+            </w:tcMar>
+          </w:tcPr>
+          <w:p>
+            <w:pPr>
+              <w:spacing w:before="0" w:after="0" w:line="252" w:lineRule="auto"/>
+            </w:pPr>
+            <w:r>
+              <w:rPr>
+                <w:sz w:val="17"/>
+              </w:rPr>
+              <w:t>约 1.000</w:t>
+            </w:r>
+          </w:p>
+        </w:tc>
+        <w:tc>
+          <w:tcPr>
+            <w:tcW w:type="dxa" w:w="1811"/>
+            <w:vAlign w:val="center"/>
+            <w:tcMar>
+              <w:top w:w="90" w:type="dxa"/>
+              <w:start w:w="110" w:type="dxa"/>
+              <w:bottom w:w="90" w:type="dxa"/>
+              <w:end w:w="110" w:type="dxa"/>
+            </w:tcMar>
+          </w:tcPr>
+          <w:p>
+            <w:pPr>
+              <w:spacing w:before="0" w:after="0" w:line="252" w:lineRule="auto"/>
+            </w:pPr>
+            <w:r>
+              <w:rPr>
+                <w:sz w:val="17"/>
+              </w:rPr>
+              <w:t>高精度、召回不足；疑似 annotation 与 prediction 同源，只作回归参考</w:t>
+            </w:r>
+          </w:p>
+        </w:tc>
+      </w:tr>
+      <w:tr>
+        <w:tc>
+          <w:tcPr>
+            <w:tcW w:type="dxa" w:w="1890"/>
+            <w:vAlign w:val="center"/>
+            <w:tcMar>
+              <w:top w:w="90" w:type="dxa"/>
+              <w:start w:w="110" w:type="dxa"/>
+              <w:bottom w:w="90" w:type="dxa"/>
+              <w:end w:w="110" w:type="dxa"/>
+            </w:tcMar>
+          </w:tcPr>
+          <w:p>
+            <w:pPr>
+              <w:spacing w:before="0" w:after="0" w:line="252" w:lineRule="auto"/>
+              <w:jc w:val="center"/>
+            </w:pPr>
+            <w:r>
+              <w:rPr>
+                <w:sz w:val="17"/>
+              </w:rPr>
+              <w:t>qwen2.5vl:7b，compact，1280，无 tile</w:t>
+            </w:r>
+          </w:p>
+        </w:tc>
+        <w:tc>
+          <w:tcPr>
+            <w:tcW w:type="dxa" w:w="2283"/>
+            <w:vAlign w:val="center"/>
+            <w:tcMar>
+              <w:top w:w="90" w:type="dxa"/>
+              <w:start w:w="110" w:type="dxa"/>
+              <w:bottom w:w="90" w:type="dxa"/>
+              <w:end w:w="110" w:type="dxa"/>
+            </w:tcMar>
+          </w:tcPr>
+          <w:p>
+            <w:pPr>
+              <w:spacing w:before="0" w:after="0" w:line="252" w:lineRule="auto"/>
+            </w:pPr>
+            <w:r>
+              <w:rPr>
+                <w:sz w:val="17"/>
+              </w:rPr>
+              <w:t>20 张；24 GT；21 Pred；0 失败</w:t>
+            </w:r>
+          </w:p>
+        </w:tc>
+        <w:tc>
+          <w:tcPr>
+            <w:tcW w:type="dxa" w:w="630"/>
+            <w:vAlign w:val="center"/>
+            <w:tcMar>
+              <w:top w:w="90" w:type="dxa"/>
+              <w:start w:w="110" w:type="dxa"/>
+              <w:bottom w:w="90" w:type="dxa"/>
+              <w:end w:w="110" w:type="dxa"/>
+            </w:tcMar>
+          </w:tcPr>
+          <w:p>
+            <w:pPr>
+              <w:spacing w:before="0" w:after="0" w:line="252" w:lineRule="auto"/>
+            </w:pPr>
+            <w:r>
+              <w:rPr>
+                <w:sz w:val="17"/>
+              </w:rPr>
+              <w:t>0.50</w:t>
+            </w:r>
+          </w:p>
+        </w:tc>
+        <w:tc>
+          <w:tcPr>
+            <w:tcW w:type="dxa" w:w="1496"/>
+            <w:vAlign w:val="center"/>
+            <w:tcMar>
+              <w:top w:w="90" w:type="dxa"/>
+              <w:start w:w="110" w:type="dxa"/>
+              <w:bottom w:w="90" w:type="dxa"/>
+              <w:end w:w="110" w:type="dxa"/>
+            </w:tcMar>
+          </w:tcPr>
+          <w:p>
+            <w:pPr>
+              <w:spacing w:before="0" w:after="0" w:line="252" w:lineRule="auto"/>
+            </w:pPr>
+            <w:r>
+              <w:rPr>
+                <w:sz w:val="17"/>
+              </w:rPr>
+              <w:t>1.000 / 0.875 / 0.933</w:t>
+            </w:r>
+          </w:p>
+        </w:tc>
+        <w:tc>
+          <w:tcPr>
+            <w:tcW w:type="dxa" w:w="1102"/>
+            <w:vAlign w:val="center"/>
+            <w:tcMar>
+              <w:top w:w="90" w:type="dxa"/>
+              <w:start w:w="110" w:type="dxa"/>
+              <w:bottom w:w="90" w:type="dxa"/>
+              <w:end w:w="110" w:type="dxa"/>
+            </w:tcMar>
+          </w:tcPr>
+          <w:p>
+            <w:pPr>
+              <w:spacing w:before="0" w:after="0" w:line="252" w:lineRule="auto"/>
+            </w:pPr>
+            <w:r>
+              <w:rPr>
+                <w:sz w:val="17"/>
+              </w:rPr>
+              <w:t>0.818</w:t>
+            </w:r>
+          </w:p>
+        </w:tc>
+        <w:tc>
+          <w:tcPr>
+            <w:tcW w:type="dxa" w:w="1811"/>
+            <w:vAlign w:val="center"/>
+            <w:tcMar>
+              <w:top w:w="90" w:type="dxa"/>
+              <w:start w:w="110" w:type="dxa"/>
+              <w:bottom w:w="90" w:type="dxa"/>
+              <w:end w:w="110" w:type="dxa"/>
+            </w:tcMar>
+          </w:tcPr>
+          <w:p>
+            <w:pPr>
+              <w:spacing w:before="0" w:after="0" w:line="252" w:lineRule="auto"/>
+            </w:pPr>
+            <w:r>
+              <w:rPr>
+                <w:sz w:val="17"/>
+              </w:rPr>
+              <w:t>当前最有希望的高精度预标注设置，但样本量过小</w:t>
+            </w:r>
+          </w:p>
+        </w:tc>
+      </w:tr>
+      <w:tr>
+        <w:tc>
+          <w:tcPr>
+            <w:tcW w:type="dxa" w:w="1890"/>
+            <w:vAlign w:val="center"/>
+            <w:tcMar>
+              <w:top w:w="90" w:type="dxa"/>
+              <w:start w:w="110" w:type="dxa"/>
+              <w:bottom w:w="90" w:type="dxa"/>
+              <w:end w:w="110" w:type="dxa"/>
+            </w:tcMar>
+          </w:tcPr>
+          <w:p>
+            <w:pPr>
+              <w:spacing w:before="0" w:after="0" w:line="252" w:lineRule="auto"/>
+              <w:jc w:val="center"/>
+            </w:pPr>
+            <w:r>
+              <w:rPr>
+                <w:sz w:val="17"/>
+              </w:rPr>
+              <w:t>qwen2.5vl:7b，compact，1280，无 tile</w:t>
+            </w:r>
+          </w:p>
+        </w:tc>
+        <w:tc>
+          <w:tcPr>
+            <w:tcW w:type="dxa" w:w="2283"/>
+            <w:vAlign w:val="center"/>
+            <w:tcMar>
+              <w:top w:w="90" w:type="dxa"/>
+              <w:start w:w="110" w:type="dxa"/>
+              <w:bottom w:w="90" w:type="dxa"/>
+              <w:end w:w="110" w:type="dxa"/>
+            </w:tcMar>
+          </w:tcPr>
+          <w:p>
+            <w:pPr>
+              <w:spacing w:before="0" w:after="0" w:line="252" w:lineRule="auto"/>
+            </w:pPr>
+            <w:r>
+              <w:rPr>
+                <w:sz w:val="17"/>
+              </w:rPr>
+              <w:t>20 张；24 GT；21 Pred；0 失败</w:t>
+            </w:r>
+          </w:p>
+        </w:tc>
+        <w:tc>
+          <w:tcPr>
+            <w:tcW w:type="dxa" w:w="630"/>
+            <w:vAlign w:val="center"/>
+            <w:tcMar>
+              <w:top w:w="90" w:type="dxa"/>
+              <w:start w:w="110" w:type="dxa"/>
+              <w:bottom w:w="90" w:type="dxa"/>
+              <w:end w:w="110" w:type="dxa"/>
+            </w:tcMar>
+          </w:tcPr>
+          <w:p>
+            <w:pPr>
+              <w:spacing w:before="0" w:after="0" w:line="252" w:lineRule="auto"/>
+            </w:pPr>
+            <w:r>
+              <w:rPr>
+                <w:sz w:val="17"/>
+              </w:rPr>
+              <w:t>0.75</w:t>
+            </w:r>
+          </w:p>
+        </w:tc>
+        <w:tc>
+          <w:tcPr>
+            <w:tcW w:type="dxa" w:w="1496"/>
+            <w:vAlign w:val="center"/>
+            <w:tcMar>
+              <w:top w:w="90" w:type="dxa"/>
+              <w:start w:w="110" w:type="dxa"/>
+              <w:bottom w:w="90" w:type="dxa"/>
+              <w:end w:w="110" w:type="dxa"/>
+            </w:tcMar>
+          </w:tcPr>
+          <w:p>
+            <w:pPr>
+              <w:spacing w:before="0" w:after="0" w:line="252" w:lineRule="auto"/>
+            </w:pPr>
+            <w:r>
+              <w:rPr>
+                <w:sz w:val="17"/>
+              </w:rPr>
+              <w:t>0.762 / 0.667 / 0.711</w:t>
+            </w:r>
+          </w:p>
+        </w:tc>
+        <w:tc>
+          <w:tcPr>
+            <w:tcW w:type="dxa" w:w="1102"/>
+            <w:vAlign w:val="center"/>
+            <w:tcMar>
+              <w:top w:w="90" w:type="dxa"/>
+              <w:start w:w="110" w:type="dxa"/>
+              <w:bottom w:w="90" w:type="dxa"/>
+              <w:end w:w="110" w:type="dxa"/>
+            </w:tcMar>
+          </w:tcPr>
+          <w:p>
+            <w:pPr>
+              <w:spacing w:before="0" w:after="0" w:line="252" w:lineRule="auto"/>
+            </w:pPr>
+            <w:r>
+              <w:rPr>
+                <w:sz w:val="17"/>
+              </w:rPr>
+              <w:t>0.850</w:t>
+            </w:r>
+          </w:p>
+        </w:tc>
+        <w:tc>
+          <w:tcPr>
+            <w:tcW w:type="dxa" w:w="1811"/>
+            <w:vAlign w:val="center"/>
+            <w:tcMar>
+              <w:top w:w="90" w:type="dxa"/>
+              <w:start w:w="110" w:type="dxa"/>
+              <w:bottom w:w="90" w:type="dxa"/>
+              <w:end w:w="110" w:type="dxa"/>
+            </w:tcMar>
+          </w:tcPr>
+          <w:p>
+            <w:pPr>
+              <w:spacing w:before="0" w:after="0" w:line="252" w:lineRule="auto"/>
+            </w:pPr>
+            <w:r>
+              <w:rPr>
+                <w:sz w:val="17"/>
+              </w:rPr>
+              <w:t>严格定位阈值下明显下降，仍需优化框位置与完整性</w:t>
+            </w:r>
+          </w:p>
+        </w:tc>
+      </w:tr>
+    </w:tbl>
+    <w:p>
+      <w:pPr>
+        <w:keepLines w:val="0"/>
+      </w:pPr>
+      <w:r>
+        <w:t>分场景观察（20 张 7B 样本，IoU 0.50）：</w:t>
+      </w:r>
+    </w:p>
+    <w:p>
+      <w:pPr>
+        <w:pStyle w:val="a0"/>
+        <w:keepLines w:val="0"/>
+      </w:pPr>
+      <w:r>
+        <w:t>人员睡岗：12 GT、12 TP、0 FP、0 FN，Precision/Recall/F1 均为 1.000。</w:t>
+      </w:r>
+    </w:p>
+    <w:p>
+      <w:pPr>
+        <w:pStyle w:val="a0"/>
+        <w:keepLines w:val="0"/>
+      </w:pPr>
+      <w:r>
+        <w:t>人员跌倒：12 GT、9 TP、0 FP、3 FN，Precision 1.000、Recall 0.750、F1 0.857。</w:t>
+      </w:r>
+    </w:p>
+    <w:p>
+      <w:pPr>
+        <w:pStyle w:val="a0"/>
+        <w:keepLines w:val="0"/>
+      </w:pPr>
+      <w:r>
+        <w:t>当前结论：模型具有较好的高精度预标注潜力，但跌倒、多人、遮挡和小目标场景仍有漏检风险；在完成更大、独立、人工审计的 balanced golden set 评估前，不应宣称达到生产级自动标注性能。</w:t>
+      </w:r>
+    </w:p>
+    <w:p>
+      <w:pPr>
+        <w:pStyle w:val="21"/>
+        <w:keepNext/>
+        <w:keepLines w:val="0"/>
+      </w:pPr>
+      <w:r>
+        <w:t>7.4 建议的验收顺序</w:t>
+      </w:r>
+    </w:p>
+    <w:p>
+      <w:pPr>
+        <w:pStyle w:val="a"/>
+        <w:keepLines w:val="0"/>
+      </w:pPr>
+      <w:r>
+        <w:t>先在固定 20 张缓存样本上确认环境、图片访问、模型服务和解析器均无失败。</w:t>
+      </w:r>
+    </w:p>
+    <w:p>
+      <w:pPr>
+        <w:pStyle w:val="a"/>
+        <w:keepLines w:val="0"/>
+      </w:pPr>
+      <w:r>
+        <w:t>再使用 100 张和 500 张人工标注样本比较 7B、3B，以及无 tile/有 tile 两组设置。</w:t>
+      </w:r>
+    </w:p>
+    <w:p>
+      <w:pPr>
+        <w:pStyle w:val="a"/>
+        <w:keepLines w:val="0"/>
+      </w:pPr>
+      <w:r>
+        <w:t>人工复核全部 FP/FN，并按场景归因；同时统计人体框完整率和人工修正率。</w:t>
+      </w:r>
+    </w:p>
+    <w:p>
+      <w:pPr>
+        <w:pStyle w:val="a"/>
+        <w:keepLines w:val="0"/>
+      </w:pPr>
+      <w:r>
+        <w:t>固化 balanced golden set 和模型运行配置，再确定正式上线门槛；门槛未确认前保持人工复核。</w:t>
+      </w:r>
+    </w:p>
+    <w:p>
+      <w:pPr>
+        <w:pStyle w:val="1"/>
+        <w:keepNext/>
         <w:rPr>
           <w:lang w:eastAsia="zh-CN"/>
         </w:rPr>
       </w:pPr>
       <w:r>
-        <w:rPr>
-          <w:rFonts w:ascii="微软雅黑" w:eastAsia="微软雅黑" w:hAnsi="微软雅黑"/>
-          <w:sz w:val="32"/>
-          <w:lang w:eastAsia="zh-CN"/>
-        </w:rPr>
-        <w:t>7. 已有数据与评测可行性</w:t>
+        <w:t>8. 已有数据与评测可行性</w:t>
       </w:r>
     </w:p>
     <w:p>
@@ -2172,12 +4218,10 @@
     <w:p>
       <w:pPr>
         <w:pStyle w:val="21"/>
+        <w:keepNext/>
       </w:pPr>
       <w:r>
-        <w:rPr>
-          <w:rFonts w:ascii="微软雅黑" w:eastAsia="微软雅黑" w:hAnsi="微软雅黑"/>
-        </w:rPr>
-        <w:t>7.1 历史运行数据</w:t>
+        <w:t>8.1 历史运行数据</w:t>
       </w:r>
     </w:p>
     <w:tbl>
@@ -2764,12 +4808,10 @@
     <w:p>
       <w:pPr>
         <w:pStyle w:val="21"/>
+        <w:keepNext/>
       </w:pPr>
       <w:r>
-        <w:rPr>
-          <w:rFonts w:ascii="微软雅黑" w:eastAsia="微软雅黑" w:hAnsi="微软雅黑"/>
-        </w:rPr>
-        <w:t>7.2 SH16 / Label Studio 数据</w:t>
+        <w:t>8.2 SH16 / Label Studio 数据</w:t>
       </w:r>
     </w:p>
     <w:tbl>
@@ -3067,12 +5109,10 @@
     <w:p>
       <w:pPr>
         <w:pStyle w:val="21"/>
+        <w:keepNext/>
       </w:pPr>
       <w:r>
-        <w:rPr>
-          <w:rFonts w:ascii="微软雅黑" w:eastAsia="微软雅黑" w:hAnsi="微软雅黑"/>
-        </w:rPr>
-        <w:t>7.3 跌倒复核数据</w:t>
+        <w:t>8.3 跌倒复核数据</w:t>
       </w:r>
     </w:p>
     <w:tbl>
@@ -3266,13 +5306,10 @@
     <w:p>
       <w:pPr>
         <w:pStyle w:val="1"/>
+        <w:keepNext/>
       </w:pPr>
       <w:r>
-        <w:rPr>
-          <w:rFonts w:ascii="微软雅黑" w:eastAsia="微软雅黑" w:hAnsi="微软雅黑"/>
-          <w:sz w:val="32"/>
-        </w:rPr>
-        <w:t>8. 评测集建设建议</w:t>
+        <w:t>9. 评测集建设建议</w:t>
       </w:r>
     </w:p>
     <w:p>
@@ -3337,13 +5374,10 @@
     <w:p>
       <w:pPr>
         <w:pStyle w:val="1"/>
+        <w:keepNext/>
       </w:pPr>
       <w:r>
-        <w:rPr>
-          <w:rFonts w:ascii="微软雅黑" w:eastAsia="微软雅黑" w:hAnsi="微软雅黑"/>
-          <w:sz w:val="32"/>
-        </w:rPr>
-        <w:t>9. 风险与下一步计划</w:t>
+        <w:t>10. 风险与下一步计划</w:t>
       </w:r>
     </w:p>
     <w:tbl>
@@ -3684,14 +5718,10 @@
     <w:p>
       <w:pPr>
         <w:pStyle w:val="1"/>
+        <w:keepNext/>
       </w:pPr>
       <w:r>
-        <w:rPr>
-          <w:rFonts w:ascii="微软雅黑" w:eastAsia="微软雅黑" w:hAnsi="微软雅黑"/>
-          <w:sz w:val="32"/>
-        </w:rPr>
-        <w:lastRenderedPageBreak/>
-        <w:t>10. 汇报结论</w:t>
+        <w:t>11. 汇报结论</w:t>
       </w:r>
     </w:p>
     <w:p>
@@ -3702,7 +5732,7 @@
         <w:rPr>
           <w:sz w:val="21"/>
         </w:rPr>
-        <w:t>当前 feature/aotu-label 分支已经具备自动化标注的工程闭环：批处理入口、检测适配器、人体框修正、统一去重、裁剪复核、分类、契约校验、Label Studio 导出和质量汇总。</w:t>
+        <w:t>当前 main 分支已经具备自动化标注的工程闭环：批处理入口、检测适配器、人体框修正、统一去重、裁剪复核、分类、契约校验、Label Studio 导出和质量汇总。</w:t>
       </w:r>
     </w:p>
     <w:p>
@@ -3723,6 +5753,7 @@
     <w:p>
       <w:pPr>
         <w:pStyle w:val="1"/>
+        <w:keepNext/>
       </w:pPr>
       <w:r>
         <w:rPr>
@@ -3748,10 +5779,7 @@
         <w:pStyle w:val="a0"/>
       </w:pPr>
       <w:r>
-        <w:rPr>
-          <w:sz w:val="21"/>
-        </w:rPr>
-        <w:t>运行证据：本轮 pytest 输出 43 passed；Git 分支 feature/aotu-label；最新提交 c36f464 Remove redundant pipeline wrapper scripts。</w:t>
+        <w:t>运行证据：核心契约与流水线测试历史记录为 43 passed；性能数据来自 person_labelstudio_172_25_9_142_20260706 benchmark 及 2026-07-18 模块消融记录。</w:t>
       </w:r>
     </w:p>
     <w:p>
@@ -3778,6 +5806,7 @@
     </w:p>
     <w:sectPr>
       <w:footerReference w:type="default" r:id="rId8"/>
+      <w:headerReference w:type="default" r:id="rId11"/>
       <w:pgSz w:w="12240" w:h="15840"/>
       <w:pgMar w:top="1080" w:right="1152" w:bottom="1080" w:left="1152" w:header="720" w:footer="720" w:gutter="0"/>
       <w:cols w:space="720"/>
@@ -3823,7 +5852,7 @@
       <w:rPr>
         <w:sz w:val="16"/>
       </w:rPr>
-      <w:t>自动化标注项目阶段汇报 | feature/aotu-label</w:t>
+      <w:t>自动化标注项目阶段汇报 | main</w:t>
     </w:r>
   </w:p>
 </w:ftr>
@@ -3852,6 +5881,16 @@
     </w:p>
   </w:footnote>
 </w:footnotes>
+</file>
+
+<file path=word/header1.xml><?xml version="1.0" encoding="utf-8"?>
+<w:hdr xmlns:m="http://schemas.openxmlformats.org/officeDocument/2006/math" xmlns:mc="http://schemas.openxmlformats.org/markup-compatibility/2006" xmlns:mo="http://schemas.microsoft.com/office/mac/office/2008/main" xmlns:mv="urn:schemas-microsoft-com:mac:vml" xmlns:o="urn:schemas-microsoft-com:office:office" xmlns:r="http://schemas.openxmlformats.org/officeDocument/2006/relationships" xmlns:v="urn:schemas-microsoft-com:vml" xmlns:w10="urn:schemas-microsoft-com:office:word" xmlns:w14="http://schemas.microsoft.com/office/word/2010/wordml" xmlns:w="http://schemas.openxmlformats.org/wordprocessingml/2006/main" xmlns:wne="http://schemas.microsoft.com/office/word/2006/wordml" xmlns:wp14="http://schemas.microsoft.com/office/word/2010/wordprocessingDrawing" xmlns:wp="http://schemas.openxmlformats.org/drawingml/2006/wordprocessingDrawing" xmlns:wpc="http://schemas.microsoft.com/office/word/2010/wordprocessingCanvas" xmlns:wpg="http://schemas.microsoft.com/office/word/2010/wordprocessingGroup" xmlns:wpi="http://schemas.microsoft.com/office/word/2010/wordprocessingInk" xmlns:wps="http://schemas.microsoft.com/office/word/2010/wordprocessingShape" mc:Ignorable="w14 wp14">
+  <w:p>
+    <w:pPr>
+      <w:pStyle w:val="Header"/>
+    </w:pPr>
+  </w:p>
+</w:hdr>
 </file>
 
 <file path=word/numbering.xml><?xml version="1.0" encoding="utf-8"?>

</xml_diff>